<commit_message>
v1.12.9: Portable export guide: note README.txt in package output structure
</commit_message>
<xml_diff>
--- a/docs/portable-export-user-guide.docx
+++ b/docs/portable-export-user-guide.docx
@@ -5554,6 +5554,15 @@
           <w:rStyle w:val="VerbatimChar"/>
         </w:rPr>
         <w:t xml:space="preserve">  |</w:t>
+      </w:r>
+      <w:r>
+        <w:br/>
+      </w:r>
+      <w:r>
+        <w:rPr>
+          <w:rStyle w:val="VerbatimChar"/>
+        </w:rPr>
+        <w:t xml:space="preserve">  +-- README.txt              &lt;- Start here: what this is + how to use it</w:t>
       </w:r>
       <w:r>
         <w:br/>

</xml_diff>